<commit_message>
Review pass: honesty caveats, dead-code cleanup, repo tidy
- Report: add modeling caveats (endpoint-accel masking, CHOMP-metric/Adam
  ablation confound, nominal joint limits, fill-level axis, IK-only reachability)
- spill_cost: remove dead/duplicate code; fix inaccurate "raycast" comments
- Move 26 superseded scripts to mp/_legacy/ (active pipeline imports verified)
- Remove stray figs/using/ and superseded docs/report.md

Co-Authored-By: Claude Opus 4.8 (1M context) <noreply@anthropic.com>
</commit_message>
<xml_diff>
--- a/docs/report.docx
+++ b/docs/report.docx
@@ -2123,6 +2123,71 @@
     </w:p>
     <w:p>
       <w:pPr>
+        <w:spacing w:after="100" w:before="0"/>
+        <w:jc w:val="both"/>
+      </w:pPr>
+      <w:r>
+        <w:rPr>
+          <w:b w:val="0"/>
+          <w:i w:val="0"/>
+          <w:sz w:val="19"/>
+        </w:rPr>
+        <w:t>Several modeling choices should be read with care. (a) The mug acceleration uses a central second difference with the two endpoints copied from their neighbors, which understates the launch/braking accelerations of the rest-to-rest motion, so absolute spill ratios are mildly optimistic (the relative method ordering is unaffected). (b) We apply the CHOMP M</w:t>
+      </w:r>
+      <w:r>
+        <w:rPr>
+          <w:b w:val="0"/>
+          <w:i w:val="0"/>
+          <w:sz w:val="19"/>
+          <w:vertAlign w:val="superscript"/>
+        </w:rPr>
+        <w:t>−1</w:t>
+      </w:r>
+      <w:r>
+        <w:rPr>
+          <w:b w:val="0"/>
+          <w:i w:val="0"/>
+          <w:sz w:val="19"/>
+        </w:rPr>
+        <w:t xml:space="preserve"> metric to the gradient but optimize with Adam and gradient clipping, so the metric-vs-no-metric ablation (ours vs vanilla-grad) is not a clean isolation of the covariant step; the advantage of ours is, however, corroborated independently by feasibility. (c) The joint velocity/acceleration limits (3.3 rad/s, 20 rad/s</w:t>
+      </w:r>
+      <w:r>
+        <w:rPr>
+          <w:b w:val="0"/>
+          <w:i w:val="0"/>
+          <w:sz w:val="19"/>
+          <w:vertAlign w:val="superscript"/>
+        </w:rPr>
+        <w:t>2</w:t>
+      </w:r>
+      <w:r>
+        <w:rPr>
+          <w:b w:val="0"/>
+          <w:i w:val="0"/>
+          <w:sz w:val="19"/>
+        </w:rPr>
+        <w:t>) are nominal rather than datasheet-exact and set the absolute feasibility and T* values. (d) The fill-level axis in Fig. 6 is a nominal reparameterization of θ</w:t>
+      </w:r>
+      <w:r>
+        <w:rPr>
+          <w:b w:val="0"/>
+          <w:i w:val="0"/>
+          <w:sz w:val="19"/>
+          <w:vertAlign w:val="subscript"/>
+        </w:rPr>
+        <w:t>max</w:t>
+      </w:r>
+      <w:r>
+        <w:rPr>
+          <w:b w:val="0"/>
+          <w:i w:val="0"/>
+          <w:sz w:val="19"/>
+        </w:rPr>
+        <w:t xml:space="preserve"> (the mesh is a closed solid with no modeled cavity); the spill-free fractions are real but the “% full” labels are approximate. (e) Reachability is decided by IK position error alone (no joint-limit, collision, or orientation gating), so the 36% figure conflates true infeasibility with IK-convergence limits.</w:t>
+      </w:r>
+    </w:p>
+    <w:p>
+      <w:pPr>
         <w:spacing w:after="40" w:before="140"/>
         <w:jc w:val="both"/>
       </w:pPr>

</xml_diff>